<commit_message>
Limita la entrega a los archivos exigidos por la tarea
</commit_message>
<xml_diff>
--- a/informe/Informe_Tarea1_TIC3.docx
+++ b/informe/Informe_Tarea1_TIC3.docx
@@ -2919,7 +2919,7 @@
         <w:rPr>
           <w:b w:val="0"/>
         </w:rPr>
-        <w:t>Las pruebas no son ensayos estadísticos repetidos. Los totales de GUI son acumulados y las sesiones históricas de sensibilidad pertenecen a otra campaña. No se midieron energía, vida útil de SD ni latencia absoluta. El anexo independiente conserva los 15 pantallazos de Wireshark y explica sus alcances.</w:t>
+        <w:t>Las pruebas no son ensayos estadísticos repetidos. Los totales de GUI son acumulados y las sesiones históricas de sensibilidad pertenecen a otra campaña. No se midieron energía, vida útil de SD ni latencia absoluta. Los 15 pantallazos y sus breves descripciones se conservan en la carpeta wireshark/.</w:t>
       </w:r>
     </w:p>
     <w:p>
@@ -2936,7 +2936,7 @@
           <w:b w:val="0"/>
           <w:sz w:val="18"/>
         </w:rPr>
-        <w:t>[1] Tarea 1 - Taller de Integración TIC (TIC3). Enunciado del curso, 22-09-2026. RF1-RF9 y entregables. Archivo: referencias/Tarea1_TIC3.pdf.</w:t>
+        <w:t>[1] Tarea 1 - Taller de Integración TIC (TIC3). Enunciado del curso, 22-09-2026. RF1-RF9 y entregables.</w:t>
       </w:r>
     </w:p>
     <w:p>
@@ -2963,7 +2963,7 @@
           <w:b w:val="0"/>
           <w:sz w:val="18"/>
         </w:rPr>
-        <w:t>[4] Capturas del AP: wireshark/ap/T01 a T05, 21-10-2026. Método y cifras reproducibles en analisis_resultados.json y analizar_resultados.py, adjuntos al informe en el repositorio.</w:t>
+        <w:t>[4] Capturas del AP: wireshark/ap/T01 a T05, 21-10-2026. Cifras obtenidas al filtrar el transporte y puerto 5001, reensamblar los mensajes TIC3 y verificar conteos y CRC con el receptor del proyecto.</w:t>
       </w:r>
     </w:p>
     <w:p>

</xml_diff>